<commit_message>
Final paper with all fixes applied
</commit_message>
<xml_diff>
--- a/01_Paper/Baggu_VSK_2026_MultiPlatformERP_JFM_Submission.docx
+++ b/01_Paper/Baggu_VSK_2026_MultiPlatformERP_JFM_Submission.docx
@@ -16679,15 +16679,6 @@
         </w:rPr>
         <w:t xml:space="preserve">, 13(11), 22–35. </w:t>
       </w:r>
-      <w:hyperlink r:id="rId23" w:history="1">
-        <w:r>
-          <w:rPr>
-            <w:rStyle w:val="Hyperlink"/>
-            <w:rFonts w:ascii="Times New Roman" w:hAnsi="Times New Roman" w:cs="Times New Roman"/>
-          </w:rPr>
-          <w:t>https://www.researchgate.net/publication/390201091</w:t>
-        </w:r>
-      </w:hyperlink>
     </w:p>
     <w:p>
       <w:pPr>
@@ -16738,7 +16729,7 @@
         </w:rPr>
         <w:t xml:space="preserve"> Research. </w:t>
       </w:r>
-      <w:hyperlink r:id="rId24" w:history="1">
+      <w:hyperlink r:id="rId23" w:history="1">
         <w:r>
           <w:rPr>
             <w:rStyle w:val="Hyperlink"/>
@@ -16803,16 +16794,7 @@
           <w:i/>
           <w:iCs/>
         </w:rPr>
-        <w:t xml:space="preserve">International Journal of Intelligent Systems and </w:t>
-      </w:r>
-      <w:r>
-        <w:rPr>
-          <w:rFonts w:ascii="Times New Roman" w:hAnsi="Times New Roman" w:cs="Times New Roman"/>
-          <w:i/>
-          <w:iCs/>
-        </w:rPr>
-        <w:lastRenderedPageBreak/>
-        <w:t>Applications in Engineering</w:t>
+        <w:t>International Journal of Intelligent Systems and Applications in Engineering</w:t>
       </w:r>
       <w:r>
         <w:rPr>
@@ -16820,7 +16802,7 @@
         </w:rPr>
         <w:t xml:space="preserve">, 12(1s), 142–147. </w:t>
       </w:r>
-      <w:hyperlink r:id="rId25" w:history="1">
+      <w:hyperlink r:id="rId24" w:history="1">
         <w:r>
           <w:rPr>
             <w:rStyle w:val="Hyperlink"/>
@@ -16842,6 +16824,7 @@
         <w:rPr>
           <w:rFonts w:ascii="Times New Roman" w:hAnsi="Times New Roman" w:cs="Times New Roman"/>
         </w:rPr>
+        <w:lastRenderedPageBreak/>
         <w:t>Osnes</w:t>
       </w:r>
       <w:proofErr w:type="spellEnd"/>
@@ -16893,7 +16876,7 @@
         </w:rPr>
         <w:t xml:space="preserve">, 138, 541–548. </w:t>
       </w:r>
-      <w:hyperlink r:id="rId26" w:history="1">
+      <w:hyperlink r:id="rId25" w:history="1">
         <w:r>
           <w:rPr>
             <w:rStyle w:val="Hyperlink"/>
@@ -16952,7 +16935,7 @@
         </w:rPr>
         <w:t xml:space="preserve">, 13, 12678. </w:t>
       </w:r>
-      <w:hyperlink r:id="rId27" w:history="1">
+      <w:hyperlink r:id="rId26" w:history="1">
         <w:r>
           <w:rPr>
             <w:rStyle w:val="Hyperlink"/>
@@ -17020,7 +17003,7 @@
         </w:rPr>
         <w:t xml:space="preserve">, 14(11), 614. </w:t>
       </w:r>
-      <w:hyperlink r:id="rId28" w:history="1">
+      <w:hyperlink r:id="rId27" w:history="1">
         <w:r>
           <w:rPr>
             <w:rStyle w:val="Hyperlink"/>
@@ -17065,7 +17048,7 @@
         </w:rPr>
         <w:t xml:space="preserve">, 10(2), 2257924. </w:t>
       </w:r>
-      <w:hyperlink r:id="rId29" w:history="1">
+      <w:hyperlink r:id="rId28" w:history="1">
         <w:r>
           <w:rPr>
             <w:rStyle w:val="Hyperlink"/>
@@ -17152,7 +17135,7 @@
         </w:rPr>
         <w:t xml:space="preserve">. </w:t>
       </w:r>
-      <w:hyperlink r:id="rId30" w:history="1">
+      <w:hyperlink r:id="rId29" w:history="1">
         <w:r>
           <w:rPr>
             <w:rStyle w:val="Hyperlink"/>
@@ -17273,24 +17256,97 @@
           <w:sz w:val="28"/>
           <w:szCs w:val="28"/>
         </w:rPr>
+        <w:t>DECLARATION</w:t>
+      </w:r>
+    </w:p>
+    <w:p>
+      <w:pPr>
+        <w:spacing w:line="360" w:lineRule="auto"/>
+        <w:rPr>
+          <w:rFonts w:ascii="Times New Roman" w:hAnsi="Times New Roman" w:cs="Times New Roman"/>
+        </w:rPr>
+      </w:pPr>
+      <w:r>
+        <w:rPr>
+          <w:rFonts w:ascii="Times New Roman" w:hAnsi="Times New Roman" w:cs="Times New Roman"/>
+          <w:b/>
+          <w:bCs/>
+        </w:rPr>
+        <w:t>Declaration of Originality</w:t>
+      </w:r>
+    </w:p>
+    <w:p>
+      <w:pPr>
+        <w:spacing w:line="360" w:lineRule="auto"/>
+        <w:jc w:val="both"/>
+        <w:rPr>
+          <w:rFonts w:ascii="Times New Roman" w:hAnsi="Times New Roman" w:cs="Times New Roman"/>
+        </w:rPr>
+      </w:pPr>
+      <w:r>
+        <w:rPr>
+          <w:rFonts w:ascii="Times New Roman" w:hAnsi="Times New Roman" w:cs="Times New Roman"/>
+        </w:rPr>
         <w:lastRenderedPageBreak/>
-        <w:t>DECLARATION</w:t>
-      </w:r>
-    </w:p>
-    <w:p>
-      <w:pPr>
-        <w:spacing w:line="360" w:lineRule="auto"/>
-        <w:rPr>
-          <w:rFonts w:ascii="Times New Roman" w:hAnsi="Times New Roman" w:cs="Times New Roman"/>
-        </w:rPr>
-      </w:pPr>
-      <w:r>
-        <w:rPr>
-          <w:rFonts w:ascii="Times New Roman" w:hAnsi="Times New Roman" w:cs="Times New Roman"/>
-          <w:b/>
-          <w:bCs/>
-        </w:rPr>
-        <w:t>Declaration of Originality</w:t>
+        <w:t>I hereby declare that this manuscript, titled "Multi-Platform ERP Navigation in Facility Management Contracting: An Empirical Mixed-Methods Analysis of Invoice Rejection Drivers, Operational Inefficiencies, and Compensatory Workarounds Using SQL Analytics and Power BI Visualization," is my own original work and has not been previously published or submitted for publication in any other journal or conference. All sources consulted during the preparation of this manuscript have been appropriately cited and referenced in accordance with APA 7th Edition guidelines.</w:t>
+      </w:r>
+    </w:p>
+    <w:p>
+      <w:pPr>
+        <w:spacing w:line="360" w:lineRule="auto"/>
+        <w:rPr>
+          <w:rFonts w:ascii="Times New Roman" w:hAnsi="Times New Roman" w:cs="Times New Roman"/>
+        </w:rPr>
+      </w:pPr>
+      <w:r>
+        <w:rPr>
+          <w:rFonts w:ascii="Times New Roman" w:hAnsi="Times New Roman" w:cs="Times New Roman"/>
+        </w:rPr>
+        <w:t> </w:t>
+      </w:r>
+      <w:r>
+        <w:rPr>
+          <w:rFonts w:ascii="Times New Roman" w:hAnsi="Times New Roman" w:cs="Times New Roman"/>
+          <w:b/>
+          <w:bCs/>
+        </w:rPr>
+        <w:t>Declaration of Competing Interests</w:t>
+      </w:r>
+    </w:p>
+    <w:p>
+      <w:pPr>
+        <w:spacing w:line="360" w:lineRule="auto"/>
+        <w:rPr>
+          <w:rFonts w:ascii="Times New Roman" w:hAnsi="Times New Roman" w:cs="Times New Roman"/>
+        </w:rPr>
+      </w:pPr>
+      <w:r>
+        <w:rPr>
+          <w:rFonts w:ascii="Times New Roman" w:hAnsi="Times New Roman" w:cs="Times New Roman"/>
+        </w:rPr>
+        <w:t>The author declares no competing financial interests or personal relationships that could have influenced the work reported in this manuscript.</w:t>
+      </w:r>
+    </w:p>
+    <w:p>
+      <w:pPr>
+        <w:spacing w:line="360" w:lineRule="auto"/>
+        <w:rPr>
+          <w:rFonts w:ascii="Times New Roman" w:hAnsi="Times New Roman" w:cs="Times New Roman"/>
+        </w:rPr>
+      </w:pPr>
+      <w:r>
+        <w:rPr>
+          <w:rFonts w:ascii="Times New Roman" w:hAnsi="Times New Roman" w:cs="Times New Roman"/>
+        </w:rPr>
+        <w:t> </w:t>
+      </w:r>
+      <w:r>
+        <w:rPr>
+          <w:rFonts w:ascii="Times New Roman" w:hAnsi="Times New Roman" w:cs="Times New Roman"/>
+          <w:b/>
+          <w:bCs/>
+        </w:rPr>
+        <w:t>Declaration of Funding</w:t>
       </w:r>
     </w:p>
     <w:p>
@@ -17305,7 +17361,7 @@
         <w:rPr>
           <w:rFonts w:ascii="Times New Roman" w:hAnsi="Times New Roman" w:cs="Times New Roman"/>
         </w:rPr>
-        <w:t>I hereby declare that this manuscript, titled "Multi-Platform ERP Navigation in Facility Management Contracting: An Empirical Mixed-Methods Analysis of Invoice Rejection Drivers, Operational Inefficiencies, and Compensatory Workarounds Using SQL Analytics and Power BI Visualization," is my own original work and has not been previously published or submitted for publication in any other journal or conference. All sources consulted during the preparation of this manuscript have been appropriately cited and referenced in accordance with APA 7th Edition guidelines.</w:t>
+        <w:t>This research received no specific grant from any funding agency in the public, commercial, or not-for-profit sectors. The research was conducted independently by the author in a practitioner-researcher capacity, drawing upon direct operational experience in the facility management contracting industry.</w:t>
       </w:r>
     </w:p>
     <w:p>
@@ -17327,43 +17383,7 @@
           <w:b/>
           <w:bCs/>
         </w:rPr>
-        <w:t>Declaration of Competing Interests</w:t>
-      </w:r>
-    </w:p>
-    <w:p>
-      <w:pPr>
-        <w:spacing w:line="360" w:lineRule="auto"/>
-        <w:rPr>
-          <w:rFonts w:ascii="Times New Roman" w:hAnsi="Times New Roman" w:cs="Times New Roman"/>
-        </w:rPr>
-      </w:pPr>
-      <w:r>
-        <w:rPr>
-          <w:rFonts w:ascii="Times New Roman" w:hAnsi="Times New Roman" w:cs="Times New Roman"/>
-        </w:rPr>
-        <w:t>The author declares no competing financial interests or personal relationships that could have influenced the work reported in this manuscript.</w:t>
-      </w:r>
-    </w:p>
-    <w:p>
-      <w:pPr>
-        <w:spacing w:line="360" w:lineRule="auto"/>
-        <w:rPr>
-          <w:rFonts w:ascii="Times New Roman" w:hAnsi="Times New Roman" w:cs="Times New Roman"/>
-        </w:rPr>
-      </w:pPr>
-      <w:r>
-        <w:rPr>
-          <w:rFonts w:ascii="Times New Roman" w:hAnsi="Times New Roman" w:cs="Times New Roman"/>
-        </w:rPr>
-        <w:t> </w:t>
-      </w:r>
-      <w:r>
-        <w:rPr>
-          <w:rFonts w:ascii="Times New Roman" w:hAnsi="Times New Roman" w:cs="Times New Roman"/>
-          <w:b/>
-          <w:bCs/>
-        </w:rPr>
-        <w:t>Declaration of Funding</w:t>
+        <w:t>Declaration of Data Availability</w:t>
       </w:r>
     </w:p>
     <w:p>
@@ -17378,46 +17398,9 @@
         <w:rPr>
           <w:rFonts w:ascii="Times New Roman" w:hAnsi="Times New Roman" w:cs="Times New Roman"/>
         </w:rPr>
-        <w:t>This research received no specific grant from any funding agency in the public, commercial, or not-for-profit sectors. The research was conducted independently by the author in a practitioner-researcher capacity, drawing upon direct operational experience in the facility management contracting industry.</w:t>
-      </w:r>
-    </w:p>
-    <w:p>
-      <w:pPr>
-        <w:spacing w:line="360" w:lineRule="auto"/>
-        <w:rPr>
-          <w:rFonts w:ascii="Times New Roman" w:hAnsi="Times New Roman" w:cs="Times New Roman"/>
-        </w:rPr>
-      </w:pPr>
-      <w:r>
-        <w:rPr>
-          <w:rFonts w:ascii="Times New Roman" w:hAnsi="Times New Roman" w:cs="Times New Roman"/>
-        </w:rPr>
-        <w:t> </w:t>
-      </w:r>
-      <w:r>
-        <w:rPr>
-          <w:rFonts w:ascii="Times New Roman" w:hAnsi="Times New Roman" w:cs="Times New Roman"/>
-          <w:b/>
-          <w:bCs/>
-        </w:rPr>
-        <w:t>Declaration of Data Availability</w:t>
-      </w:r>
-    </w:p>
-    <w:p>
-      <w:pPr>
-        <w:spacing w:line="360" w:lineRule="auto"/>
-        <w:jc w:val="both"/>
-        <w:rPr>
-          <w:rFonts w:ascii="Times New Roman" w:hAnsi="Times New Roman" w:cs="Times New Roman"/>
-        </w:rPr>
-      </w:pPr>
-      <w:r>
-        <w:rPr>
-          <w:rFonts w:ascii="Times New Roman" w:hAnsi="Times New Roman" w:cs="Times New Roman"/>
-        </w:rPr>
         <w:t>The anonymized dataset and SQL query scripts used in this study are available in the public GitHub repository associated with this research (</w:t>
       </w:r>
-      <w:hyperlink r:id="rId31" w:history="1">
+      <w:hyperlink r:id="rId30" w:history="1">
         <w:r>
           <w:rPr>
             <w:rStyle w:val="Hyperlink"/>
@@ -17466,14 +17449,14 @@
         <w:rPr>
           <w:rFonts w:ascii="Times New Roman" w:hAnsi="Times New Roman" w:cs="Times New Roman"/>
         </w:rPr>
-        <w:t xml:space="preserve">In accordance with Emerald Publishing's policy on the use of artificial intelligence tools, the author discloses that Claude (Anthropic, claude-sonnet-4-6) was used as a writing assistance tool during the preparation of this manuscript. Specifically, AI assistance was used to support manuscript </w:t>
+        <w:t xml:space="preserve">In accordance with Emerald Publishing's policy on the use of artificial intelligence tools, the author discloses that Claude (Anthropic, claude-sonnet-4-6) was used as a writing assistance tool during the preparation of this manuscript. Specifically, AI assistance was used to support manuscript structuring, academic language editing, and literature synthesis. The research design, data collection, 41-step data cleaning protocol, SQL database construction, Power BI dashboard development, and all statistical findings and interpretations were conducted independently by the </w:t>
       </w:r>
       <w:r>
         <w:rPr>
           <w:rFonts w:ascii="Times New Roman" w:hAnsi="Times New Roman" w:cs="Times New Roman"/>
         </w:rPr>
         <w:lastRenderedPageBreak/>
-        <w:t>structuring, academic language editing, and literature synthesis. The research design, data collection, 41-step data cleaning protocol, SQL database construction, Power BI dashboard development, and all statistical findings and interpretations were conducted independently by the author. The author takes full responsibility for the accuracy, integrity, originality, and validity of all research findings presented in this manuscript, in accordance with Emerald Publishing's authorship criteria.</w:t>
+        <w:t>author. The author takes full responsibility for the accuracy, integrity, originality, and validity of all research findings presented in this manuscript, in accordance with Emerald Publishing's authorship criteria.</w:t>
       </w:r>
     </w:p>
     <w:p>
@@ -17637,8 +17620,8 @@
       </w:pPr>
     </w:p>
     <w:sectPr>
-      <w:headerReference w:type="default" r:id="rId32"/>
-      <w:footerReference w:type="default" r:id="rId33"/>
+      <w:headerReference w:type="default" r:id="rId31"/>
+      <w:footerReference w:type="default" r:id="rId32"/>
       <w:pgSz w:w="12240" w:h="15840"/>
       <w:pgMar w:top="1440" w:right="1440" w:bottom="1440" w:left="1440" w:header="720" w:footer="720" w:gutter="0"/>
       <w:pgNumType w:start="1"/>
@@ -18904,7 +18887,6 @@
   <w:style w:type="character" w:default="1" w:styleId="DefaultParagraphFont">
     <w:name w:val="Default Paragraph Font"/>
     <w:uiPriority w:val="1"/>
-    <w:semiHidden/>
     <w:unhideWhenUsed/>
   </w:style>
   <w:style w:type="table" w:default="1" w:styleId="TableNormal">

</xml_diff>